<commit_message>
Resolve strong model and OCR agreement
</commit_message>
<xml_diff>
--- a/docs/Receipt_Orientation_Classifier_Project_Report.docx
+++ b/docs/Receipt_Orientation_Classifier_Project_Report.docx
@@ -3419,6 +3419,11 @@
       </w:r>
     </w:p>
     <w:p>
+      <w:r>
+        <w:br w:type="page"/>
+      </w:r>
+    </w:p>
+    <w:p>
       <w:pPr>
         <w:pStyle w:val="Heading2"/>
       </w:pPr>
@@ -3670,6 +3675,68 @@
                 <w:color w:val="17212B"/>
                 <w:sz w:val="19"/>
               </w:rPr>
+              <w:t>High-confidence consensus</w:t>
+            </w:r>
+          </w:p>
+        </w:tc>
+        <w:tc>
+          <w:tcPr>
+            <w:tcW w:type="dxa" w:w="4800"/>
+          </w:tcPr>
+          <w:p>
+            <w:pPr>
+              <w:spacing w:after="0"/>
+            </w:pPr>
+            <w:r>
+              <w:rPr>
+                <w:rFonts w:ascii="Calibri" w:hAnsi="Calibri"/>
+                <w:b w:val="0"/>
+                <w:i w:val="0"/>
+                <w:color w:val="17212B"/>
+                <w:sz w:val="19"/>
+              </w:rPr>
+              <w:t>Same label; OCR score &gt;= 2.0; OCR margin &gt;= 0.50; model confidence &gt;= 0.95; model margin &gt;= 0.80</w:t>
+            </w:r>
+          </w:p>
+        </w:tc>
+        <w:tc>
+          <w:tcPr>
+            <w:tcW w:type="dxa" w:w="2640"/>
+          </w:tcPr>
+          <w:p>
+            <w:pPr>
+              <w:spacing w:after="0"/>
+            </w:pPr>
+            <w:r>
+              <w:rPr>
+                <w:rFonts w:ascii="Calibri" w:hAnsi="Calibri"/>
+                <w:b w:val="0"/>
+                <w:i w:val="0"/>
+                <w:color w:val="17212B"/>
+                <w:sz w:val="19"/>
+              </w:rPr>
+              <w:t>Accept shared label</w:t>
+            </w:r>
+          </w:p>
+        </w:tc>
+      </w:tr>
+      <w:tr>
+        <w:tc>
+          <w:tcPr>
+            <w:tcW w:type="dxa" w:w="1920"/>
+          </w:tcPr>
+          <w:p>
+            <w:pPr>
+              <w:spacing w:after="0"/>
+            </w:pPr>
+            <w:r>
+              <w:rPr>
+                <w:rFonts w:ascii="Calibri" w:hAnsi="Calibri"/>
+                <w:b/>
+                <w:i w:val="0"/>
+                <w:color w:val="17212B"/>
+                <w:sz w:val="19"/>
+              </w:rPr>
               <w:t>Inconclusive</w:t>
             </w:r>
           </w:p>
@@ -3756,7 +3823,7 @@
         <w:t xml:space="preserve">• </w:t>
       </w:r>
       <w:r>
-        <w:t>A slightly weaker OCR result may confirm the model only when both sources have adequate evidence.</w:t>
+        <w:t>A low absolute OCR score may confirm an exceptionally strong matching model result only when the OCR pair remains well separated.</w:t>
       </w:r>
     </w:p>
     <w:p>
@@ -6505,7 +6572,7 @@
           <w:color w:val="17212B"/>
           <w:sz w:val="22"/>
         </w:rPr>
-        <w:t>All 18 unit tests pass, Python compilation passes, and the local app completed the public upside-down demo with the correct OCR override.</w:t>
+        <w:t>All 20 unit tests pass, Python compilation passes, and the local app completed both the public upside-down OCR override and a high-confidence tilted-left consensus regression.</w:t>
       </w:r>
     </w:p>
     <w:p>

</xml_diff>